<commit_message>
Save all recovered work
</commit_message>
<xml_diff>
--- a/documents/Website C390.docx
+++ b/documents/Website C390.docx
@@ -1171,35 +1171,6 @@
       <w:pPr>
         <w:rPr>
           <w:i/>
-          <w:color w:val="2E74B5" w:themeColor="accent5" w:themeShade="BF"/>
-        </w:rPr>
-      </w:pPr>
-      <w:r>
-        <w:rPr>
-          <w:i/>
-          <w:color w:val="EE0000"/>
-        </w:rPr>
-        <w:t>[</w:t>
-      </w:r>
-      <w:r>
-        <w:rPr>
-          <w:i/>
-          <w:color w:val="EE0000"/>
-        </w:rPr>
-        <w:t>Used in every single page</w:t>
-      </w:r>
-      <w:r>
-        <w:rPr>
-          <w:i/>
-          <w:color w:val="EE0000"/>
-        </w:rPr>
-        <w:t>]</w:t>
-      </w:r>
-    </w:p>
-    <w:p>
-      <w:pPr>
-        <w:rPr>
-          <w:i/>
           <w:color w:val="EE0000"/>
         </w:rPr>
       </w:pPr>
@@ -1223,36 +1194,7 @@
           <w:i/>
           <w:color w:val="EE0000"/>
         </w:rPr>
-        <w:t>H1 text: Cav</w:t>
-      </w:r>
-      <w:r>
-        <w:rPr>
-          <w:i/>
-          <w:color w:val="EE0000"/>
-        </w:rPr>
-        <w:t>eat</w:t>
-      </w:r>
-    </w:p>
-    <w:p>
-      <w:pPr>
-        <w:rPr>
-          <w:i/>
-          <w:color w:val="EE0000"/>
-        </w:rPr>
-      </w:pPr>
-      <w:r>
-        <w:rPr>
-          <w:i/>
-          <w:color w:val="EE0000"/>
-        </w:rPr>
-        <w:t>Main text: Comic Neue</w:t>
-      </w:r>
-      <w:r>
-        <w:rPr>
-          <w:i/>
-          <w:color w:val="EE0000"/>
-        </w:rPr>
-        <w:t xml:space="preserve"> </w:t>
+        <w:t>Text: Nunito</w:t>
       </w:r>
     </w:p>
     <w:p>
@@ -1549,6 +1491,24 @@
         </w:rPr>
         <w:t>Minimally 3 tabs with 2 layers of navigation</w:t>
       </w:r>
+    </w:p>
+    <w:p>
+      <w:pPr>
+        <w:rPr>
+          <w:b/>
+          <w:i/>
+          <w:color w:val="FF0000"/>
+        </w:rPr>
+      </w:pPr>
+    </w:p>
+    <w:p>
+      <w:pPr>
+        <w:rPr>
+          <w:b/>
+          <w:i/>
+          <w:color w:val="FF0000"/>
+        </w:rPr>
+      </w:pPr>
     </w:p>
     <w:p>
       <w:pPr>
@@ -3526,10 +3486,10 @@
             <v:path o:extrusionok="f" gradientshapeok="t" o:connecttype="rect"/>
             <o:lock v:ext="edit" aspectratio="t"/>
           </v:shapetype>
-          <v:shape id="_x0000_i1025" type="#_x0000_t75" style="width:210.85pt;height:151.25pt" o:ole="">
+          <v:shape id="_x0000_i1025" type="#_x0000_t75" style="width:210.8pt;height:151.15pt" o:ole="">
             <v:imagedata r:id="rId14" o:title=""/>
           </v:shape>
-          <o:OLEObject Type="Embed" ProgID="Unknown" ShapeID="_x0000_i1025" DrawAspect="Content" ObjectID="_1821740239" r:id="rId15"/>
+          <o:OLEObject Type="Embed" ProgID="Unknown" ShapeID="_x0000_i1025" DrawAspect="Content" ObjectID="_1822574940" r:id="rId15"/>
         </w:object>
       </w:r>
       <w:r>

</xml_diff>